<commit_message>
Refine portfolio UI and update documentation diagram
</commit_message>
<xml_diff>
--- a/docs/StuDyIo-Documentation.docx
+++ b/docs/StuDyIo-Documentation.docx
@@ -12117,62 +12117,6 @@
     </w:p>
     <w:p>
       <w:pPr>
-        <w:spacing w:before="100" w:after="20"/>
-        <w:jc w:val="center"/>
-      </w:pPr>
-      <w:r>
-        <w:drawing>
-          <wp:inline xmlns:a="http://schemas.openxmlformats.org/drawingml/2006/main" xmlns:pic="http://schemas.openxmlformats.org/drawingml/2006/picture">
-            <wp:extent cx="6263640" cy="3679889"/>
-            <wp:docPr id="1" name="Picture 1" descr="Entity relationship diagram for StuDyIo application tables"/>
-            <wp:cNvGraphicFramePr>
-              <a:graphicFrameLocks noChangeAspect="1"/>
-            </wp:cNvGraphicFramePr>
-            <a:graphic>
-              <a:graphicData uri="http://schemas.openxmlformats.org/drawingml/2006/picture">
-                <pic:pic>
-                  <pic:nvPicPr>
-                    <pic:cNvPr id="0" name="StuDyIo-ER-Diagram.png"/>
-                    <pic:cNvPicPr/>
-                  </pic:nvPicPr>
-                  <pic:blipFill>
-                    <a:blip r:embed="rId9"/>
-                    <a:stretch>
-                      <a:fillRect/>
-                    </a:stretch>
-                  </pic:blipFill>
-                  <pic:spPr>
-                    <a:xfrm>
-                      <a:off x="0" y="0"/>
-                      <a:ext cx="6263640" cy="3679889"/>
-                    </a:xfrm>
-                    <a:prstGeom prst="rect"/>
-                  </pic:spPr>
-                </pic:pic>
-              </a:graphicData>
-            </a:graphic>
-          </wp:inline>
-        </w:drawing>
-      </w:r>
-    </w:p>
-    <w:p>
-      <w:pPr>
-        <w:keepLines/>
-        <w:spacing w:before="60" w:after="40"/>
-        <w:jc w:val="center"/>
-      </w:pPr>
-      <w:r>
-        <w:rPr>
-          <w:rFonts w:ascii="Aptos" w:hAnsi="Aptos"/>
-          <w:b w:val="0"/>
-          <w:color w:val="485A54"/>
-          <w:sz w:val="17"/>
-        </w:rPr>
-        <w:t>ER diagram - application tables</w:t>
-      </w:r>
-    </w:p>
-    <w:p>
-      <w:pPr>
         <w:keepNext/>
         <w:spacing w:before="100" w:after="40"/>
       </w:pPr>
@@ -19779,6 +19723,62 @@
       <w:pPr>
         <w:spacing w:after="0" w:before="0"/>
       </w:pPr>
+    </w:p>
+    <w:p>
+      <w:pPr>
+        <w:spacing w:before="100" w:after="20"/>
+        <w:jc w:val="center"/>
+      </w:pPr>
+      <w:r>
+        <w:drawing>
+          <wp:inline xmlns:a="http://schemas.openxmlformats.org/drawingml/2006/main" xmlns:pic="http://schemas.openxmlformats.org/drawingml/2006/picture">
+            <wp:extent cx="6263640" cy="4632484"/>
+            <wp:docPr id="1" name="Picture 1" descr="Entity relationship diagram for StuDyIo application tables"/>
+            <wp:cNvGraphicFramePr>
+              <a:graphicFrameLocks noChangeAspect="1"/>
+            </wp:cNvGraphicFramePr>
+            <a:graphic>
+              <a:graphicData uri="http://schemas.openxmlformats.org/drawingml/2006/picture">
+                <pic:pic>
+                  <pic:nvPicPr>
+                    <pic:cNvPr id="0" name="StuDyIo-ER-Diagram.png"/>
+                    <pic:cNvPicPr/>
+                  </pic:nvPicPr>
+                  <pic:blipFill>
+                    <a:blip r:embed="rId9"/>
+                    <a:stretch>
+                      <a:fillRect/>
+                    </a:stretch>
+                  </pic:blipFill>
+                  <pic:spPr>
+                    <a:xfrm>
+                      <a:off x="0" y="0"/>
+                      <a:ext cx="6263640" cy="4632484"/>
+                    </a:xfrm>
+                    <a:prstGeom prst="rect"/>
+                  </pic:spPr>
+                </pic:pic>
+              </a:graphicData>
+            </a:graphic>
+          </wp:inline>
+        </w:drawing>
+      </w:r>
+    </w:p>
+    <w:p>
+      <w:pPr>
+        <w:keepLines/>
+        <w:spacing w:before="60" w:after="40"/>
+        <w:jc w:val="center"/>
+      </w:pPr>
+      <w:r>
+        <w:rPr>
+          <w:rFonts w:ascii="Aptos" w:hAnsi="Aptos"/>
+          <w:b w:val="0"/>
+          <w:color w:val="485A54"/>
+          <w:sz w:val="17"/>
+        </w:rPr>
+        <w:t>ER diagram - application tables</w:t>
+      </w:r>
     </w:p>
     <w:p>
       <w:pPr>

</xml_diff>